<commit_message>
Hago modificaciones en archivo storytelling de operaciones
</commit_message>
<xml_diff>
--- a/Equip_19/Scripts/Storytelling Operaciones_S3.docx
+++ b/Equip_19/Scripts/Storytelling Operaciones_S3.docx
@@ -39,25 +39,7 @@
           <w:sz w:val="28"/>
           <w:szCs w:val="28"/>
         </w:rPr>
-        <w:t xml:space="preserve"> Departamento de </w:t>
-      </w:r>
-      <w:r>
-        <w:rPr>
-          <w:b/>
-          <w:bCs/>
-          <w:sz w:val="28"/>
-          <w:szCs w:val="28"/>
-        </w:rPr>
-        <w:t>Operaciones y Gestión de Inventario</w:t>
-      </w:r>
-      <w:r>
-        <w:rPr>
-          <w:b/>
-          <w:bCs/>
-          <w:sz w:val="28"/>
-          <w:szCs w:val="28"/>
-        </w:rPr>
-        <w:t xml:space="preserve">. </w:t>
+        <w:t xml:space="preserve"> Departamento de Operaciones y Gestión de Inventario. </w:t>
       </w:r>
       <w:r>
         <w:rPr>
@@ -973,220 +955,6 @@
           <w:rFonts w:ascii="Calibri" w:eastAsia="Calibri" w:hAnsi="Calibri" w:cs="Calibri"/>
         </w:rPr>
       </w:pPr>
-    </w:p>
-    <w:p>
-      <w:pPr>
-        <w:numPr>
-          <w:ilvl w:val="0"/>
-          <w:numId w:val="6"/>
-        </w:numPr>
-        <w:jc w:val="both"/>
-        <w:rPr>
-          <w:rFonts w:ascii="Calibri" w:eastAsia="Calibri" w:hAnsi="Calibri" w:cs="Calibri"/>
-        </w:rPr>
-      </w:pPr>
-      <w:r>
-        <w:rPr>
-          <w:rFonts w:ascii="Calibri" w:eastAsia="Calibri" w:hAnsi="Calibri" w:cs="Calibri"/>
-          <w:b/>
-          <w:bCs/>
-        </w:rPr>
-        <w:t>Propuesta de captación</w:t>
-      </w:r>
-      <w:r>
-        <w:rPr>
-          <w:rFonts w:ascii="Calibri" w:eastAsia="Calibri" w:hAnsi="Calibri" w:cs="Calibri"/>
-        </w:rPr>
-        <w:t>:</w:t>
-      </w:r>
-    </w:p>
-    <w:p>
-      <w:pPr>
-        <w:jc w:val="both"/>
-        <w:rPr>
-          <w:rFonts w:ascii="Calibri" w:eastAsia="Calibri" w:hAnsi="Calibri" w:cs="Calibri"/>
-        </w:rPr>
-      </w:pPr>
-      <w:r>
-        <w:rPr>
-          <w:rFonts w:ascii="Calibri" w:eastAsia="Calibri" w:hAnsi="Calibri" w:cs="Calibri"/>
-        </w:rPr>
-        <w:t>Finalmente, si se llevan a cabo las propuestas previas, consideramos de interés culminar el proceso con una última acción que nos aporte un incremento del inventario de mayor valor en cada ciudad.</w:t>
-      </w:r>
-    </w:p>
-    <w:p>
-      <w:pPr>
-        <w:numPr>
-          <w:ilvl w:val="0"/>
-          <w:numId w:val="7"/>
-        </w:numPr>
-        <w:jc w:val="both"/>
-        <w:rPr>
-          <w:rFonts w:ascii="Calibri" w:eastAsia="Calibri" w:hAnsi="Calibri" w:cs="Calibri"/>
-        </w:rPr>
-      </w:pPr>
-      <w:r>
-        <w:rPr>
-          <w:rFonts w:ascii="Calibri" w:eastAsia="Calibri" w:hAnsi="Calibri" w:cs="Calibri"/>
-        </w:rPr>
-        <w:t xml:space="preserve">La </w:t>
-      </w:r>
-      <w:r>
-        <w:rPr>
-          <w:rFonts w:ascii="Calibri" w:eastAsia="Calibri" w:hAnsi="Calibri" w:cs="Calibri"/>
-          <w:u w:val="single"/>
-        </w:rPr>
-        <w:t>estrategia</w:t>
-      </w:r>
-      <w:r>
-        <w:rPr>
-          <w:rFonts w:ascii="Calibri" w:eastAsia="Calibri" w:hAnsi="Calibri" w:cs="Calibri"/>
-        </w:rPr>
-        <w:t xml:space="preserve"> consiste en enfocar los esfuerzos de adquisición de alojamientos con aquellas características que maximicen el potencial de ocupación.</w:t>
-      </w:r>
-    </w:p>
-    <w:p>
-      <w:pPr>
-        <w:ind w:left="720"/>
-        <w:jc w:val="both"/>
-        <w:rPr>
-          <w:rFonts w:ascii="Calibri" w:eastAsia="Calibri" w:hAnsi="Calibri" w:cs="Calibri"/>
-        </w:rPr>
-      </w:pPr>
-    </w:p>
-    <w:p>
-      <w:pPr>
-        <w:numPr>
-          <w:ilvl w:val="0"/>
-          <w:numId w:val="7"/>
-        </w:numPr>
-        <w:jc w:val="both"/>
-        <w:rPr>
-          <w:rFonts w:ascii="Calibri" w:eastAsia="Calibri" w:hAnsi="Calibri" w:cs="Calibri"/>
-        </w:rPr>
-      </w:pPr>
-      <w:r>
-        <w:rPr>
-          <w:rFonts w:ascii="Calibri" w:eastAsia="Calibri" w:hAnsi="Calibri" w:cs="Calibri"/>
-        </w:rPr>
-        <w:t xml:space="preserve">Para ello las </w:t>
-      </w:r>
-      <w:r>
-        <w:rPr>
-          <w:rFonts w:ascii="Calibri" w:eastAsia="Calibri" w:hAnsi="Calibri" w:cs="Calibri"/>
-          <w:u w:val="single"/>
-        </w:rPr>
-        <w:t>acciones</w:t>
-      </w:r>
-      <w:r>
-        <w:rPr>
-          <w:rFonts w:ascii="Calibri" w:eastAsia="Calibri" w:hAnsi="Calibri" w:cs="Calibri"/>
-        </w:rPr>
-        <w:t xml:space="preserve"> necesarias consisten en: </w:t>
-      </w:r>
-    </w:p>
-    <w:p>
-      <w:pPr>
-        <w:jc w:val="both"/>
-        <w:rPr>
-          <w:rFonts w:ascii="Calibri" w:eastAsia="Calibri" w:hAnsi="Calibri" w:cs="Calibri"/>
-        </w:rPr>
-      </w:pPr>
-      <w:r>
-        <w:rPr>
-          <w:rFonts w:ascii="Calibri" w:eastAsia="Calibri" w:hAnsi="Calibri" w:cs="Calibri"/>
-        </w:rPr>
-        <w:t xml:space="preserve">1. Generar un </w:t>
-      </w:r>
-      <w:proofErr w:type="spellStart"/>
-      <w:r>
-        <w:rPr>
-          <w:rFonts w:ascii="Calibri" w:eastAsia="Calibri" w:hAnsi="Calibri" w:cs="Calibri"/>
-        </w:rPr>
-        <w:t>scoring</w:t>
-      </w:r>
-      <w:proofErr w:type="spellEnd"/>
-      <w:r>
-        <w:rPr>
-          <w:rFonts w:ascii="Calibri" w:eastAsia="Calibri" w:hAnsi="Calibri" w:cs="Calibri"/>
-        </w:rPr>
-        <w:t xml:space="preserve"> de priorización para las nuevas captaciones basado en las variables explicativas del modelo de cada ciudad. </w:t>
-      </w:r>
-    </w:p>
-    <w:p>
-      <w:pPr>
-        <w:jc w:val="both"/>
-        <w:rPr>
-          <w:rFonts w:ascii="Calibri" w:eastAsia="Calibri" w:hAnsi="Calibri" w:cs="Calibri"/>
-        </w:rPr>
-      </w:pPr>
-      <w:r>
-        <w:rPr>
-          <w:rFonts w:ascii="Calibri" w:eastAsia="Calibri" w:hAnsi="Calibri" w:cs="Calibri"/>
-        </w:rPr>
-        <w:t xml:space="preserve">2. Proponer umbrales de aceptación para </w:t>
-      </w:r>
-      <w:proofErr w:type="spellStart"/>
-      <w:r>
-        <w:rPr>
-          <w:rFonts w:ascii="Calibri" w:eastAsia="Calibri" w:hAnsi="Calibri" w:cs="Calibri"/>
-        </w:rPr>
-        <w:t>partners</w:t>
-      </w:r>
-      <w:proofErr w:type="spellEnd"/>
-      <w:r>
-        <w:rPr>
-          <w:rFonts w:ascii="Calibri" w:eastAsia="Calibri" w:hAnsi="Calibri" w:cs="Calibri"/>
-        </w:rPr>
-        <w:t xml:space="preserve"> y agentes de captación (ej., "solo captar apartamentos con precio X y ubicación Y").</w:t>
-      </w:r>
-    </w:p>
-    <w:p>
-      <w:pPr>
-        <w:jc w:val="both"/>
-        <w:rPr>
-          <w:rFonts w:ascii="Calibri" w:eastAsia="Calibri" w:hAnsi="Calibri" w:cs="Calibri"/>
-        </w:rPr>
-      </w:pPr>
-    </w:p>
-    <w:p>
-      <w:pPr>
-        <w:numPr>
-          <w:ilvl w:val="0"/>
-          <w:numId w:val="1"/>
-        </w:numPr>
-        <w:jc w:val="both"/>
-        <w:rPr>
-          <w:rFonts w:ascii="Calibri" w:eastAsia="Calibri" w:hAnsi="Calibri" w:cs="Calibri"/>
-        </w:rPr>
-      </w:pPr>
-      <w:proofErr w:type="gramStart"/>
-      <w:r>
-        <w:rPr>
-          <w:rFonts w:ascii="Calibri" w:eastAsia="Calibri" w:hAnsi="Calibri" w:cs="Calibri"/>
-        </w:rPr>
-        <w:t xml:space="preserve">Los </w:t>
-      </w:r>
-      <w:r>
-        <w:rPr>
-          <w:rFonts w:ascii="Calibri" w:eastAsia="Calibri" w:hAnsi="Calibri" w:cs="Calibri"/>
-          <w:u w:val="single"/>
-        </w:rPr>
-        <w:t>recursos</w:t>
-      </w:r>
-      <w:r>
-        <w:rPr>
-          <w:rFonts w:ascii="Calibri" w:eastAsia="Calibri" w:hAnsi="Calibri" w:cs="Calibri"/>
-        </w:rPr>
-        <w:t xml:space="preserve"> a movilizar</w:t>
-      </w:r>
-      <w:proofErr w:type="gramEnd"/>
-      <w:r>
-        <w:rPr>
-          <w:rFonts w:ascii="Calibri" w:eastAsia="Calibri" w:hAnsi="Calibri" w:cs="Calibri"/>
-        </w:rPr>
-        <w:t xml:space="preserve"> con esta propuesta afectan al departamento de marketing, quien estaría encargado de la captación de nuevos activos para la empresa.</w:t>
-      </w:r>
     </w:p>
     <w:sectPr>
       <w:footerReference w:type="default" r:id="rId8"/>

</xml_diff>